<commit_message>
added voting page for usrs
</commit_message>
<xml_diff>
--- a/documentaion BB.docx
+++ b/documentaion BB.docx
@@ -398,6 +398,14 @@
         </w:rPr>
         <w:t>phone number OTP)</w:t>
       </w:r>
+      <w:r>
+        <w:rPr>
+          <w:b/>
+          <w:bCs/>
+          <w:lang w:val="en-US"/>
+        </w:rPr>
+        <w:t xml:space="preserve"> done</w:t>
+      </w:r>
     </w:p>
     <w:p>
       <w:pPr>
@@ -418,7 +426,33 @@
           <w:bCs/>
           <w:lang w:val="en-US"/>
         </w:rPr>
-        <w:t>Face identification for one person one vote</w:t>
+        <w:t xml:space="preserve">Face identification for one person one </w:t>
+      </w:r>
+      <w:proofErr w:type="gramStart"/>
+      <w:r>
+        <w:rPr>
+          <w:b/>
+          <w:bCs/>
+          <w:lang w:val="en-US"/>
+        </w:rPr>
+        <w:t>vote</w:t>
+      </w:r>
+      <w:r>
+        <w:rPr>
+          <w:b/>
+          <w:bCs/>
+          <w:lang w:val="en-US"/>
+        </w:rPr>
+        <w:t xml:space="preserve"> )done</w:t>
+      </w:r>
+      <w:proofErr w:type="gramEnd"/>
+      <w:r>
+        <w:rPr>
+          <w:b/>
+          <w:bCs/>
+          <w:lang w:val="en-US"/>
+        </w:rPr>
+        <w:t xml:space="preserve"> not integrated)</w:t>
       </w:r>
     </w:p>
     <w:p>
@@ -546,6 +580,17 @@
         </w:rPr>
         <w:t>Timed Voting Window</w:t>
       </w:r>
+      <w:r>
+        <w:rPr>
+          <w:rFonts w:eastAsia="Times New Roman" w:cs="Times New Roman"/>
+          <w:b/>
+          <w:bCs/>
+          <w:kern w:val="0"/>
+          <w:lang w:eastAsia="en-GB"/>
+          <w14:ligatures w14:val="none"/>
+        </w:rPr>
+        <w:t xml:space="preserve"> (done)</w:t>
+      </w:r>
     </w:p>
     <w:p>
       <w:pPr>
@@ -724,6 +769,17 @@
           <w14:ligatures w14:val="none"/>
         </w:rPr>
         <w:t>Start or stop elections</w:t>
+      </w:r>
+      <w:r>
+        <w:rPr>
+          <w:rFonts w:eastAsia="Times New Roman" w:cs="Times New Roman"/>
+          <w:b/>
+          <w:bCs/>
+          <w:kern w:val="0"/>
+          <w:lang w:eastAsia="en-GB"/>
+          <w14:ligatures w14:val="none"/>
+        </w:rPr>
+        <w:t xml:space="preserve"> </w:t>
       </w:r>
     </w:p>
     <w:p>
@@ -949,6 +1005,7 @@
         <w:rPr>
           <w:b/>
           <w:bCs/>
+          <w:noProof/>
           <w:sz w:val="32"/>
           <w:szCs w:val="32"/>
           <w:lang w:val="en-US"/>

</xml_diff>